<commit_message>
Update Disaster Recovery doc
</commit_message>
<xml_diff>
--- a/aws-projects/aws-crossregion-disaster-recovery/docs/Cross Region Disaster Recovery.docx
+++ b/aws-projects/aws-crossregion-disaster-recovery/docs/Cross Region Disaster Recovery.docx
@@ -260,11 +260,20 @@
     <w:p>
       <w:pPr>
         <w:ind w:right="40"/>
-      </w:pPr>
-      <w:r>
+        <w:rPr>
+          <w:sz w:val="24"/>
+        </w:rPr>
+      </w:pPr>
+      <w:r>
+        <w:rPr>
+          <w:sz w:val="24"/>
+        </w:rPr>
         <w:t>See folder called “cross-region-disaster-recovery”</w:t>
       </w:r>
       <w:r>
+        <w:rPr>
+          <w:sz w:val="24"/>
+        </w:rPr>
         <w:t xml:space="preserve"> in the GitHub repo</w:t>
       </w:r>
     </w:p>
@@ -614,13 +623,7 @@
         <w:rPr>
           <w:sz w:val="24"/>
         </w:rPr>
-        <w:t>Go</w:t>
-      </w:r>
-      <w:r>
-        <w:rPr>
-          <w:sz w:val="24"/>
-        </w:rPr>
-        <w:t xml:space="preserve"> over to the EC2 management console and click on Security Groups on the left-hand side of the page. </w:t>
+        <w:t xml:space="preserve">Go over to the EC2 management console and click on Security Groups on the left-hand side of the page. </w:t>
       </w:r>
     </w:p>
     <w:p>
@@ -951,8 +954,14 @@
           <w:numId w:val="2"/>
         </w:numPr>
         <w:ind w:left="1497" w:right="40" w:hanging="361"/>
-      </w:pPr>
-      <w:r>
+        <w:rPr>
+          <w:sz w:val="24"/>
+        </w:rPr>
+      </w:pPr>
+      <w:r>
+        <w:rPr>
+          <w:sz w:val="24"/>
+        </w:rPr>
         <w:t xml:space="preserve">Click create. </w:t>
       </w:r>
     </w:p>
@@ -960,8 +969,14 @@
       <w:pPr>
         <w:spacing w:after="0" w:line="259" w:lineRule="auto"/>
         <w:ind w:left="1496" w:firstLine="0"/>
-      </w:pPr>
-      <w:r>
+        <w:rPr>
+          <w:sz w:val="24"/>
+        </w:rPr>
+      </w:pPr>
+      <w:r>
+        <w:rPr>
+          <w:sz w:val="24"/>
+        </w:rPr>
         <w:t xml:space="preserve"> </w:t>
       </w:r>
     </w:p>
@@ -1044,8 +1059,14 @@
           <w:numId w:val="3"/>
         </w:numPr>
         <w:ind w:right="40" w:hanging="360"/>
-      </w:pPr>
-      <w:r>
+        <w:rPr>
+          <w:sz w:val="24"/>
+        </w:rPr>
+      </w:pPr>
+      <w:r>
+        <w:rPr>
+          <w:sz w:val="24"/>
+        </w:rPr>
         <w:t xml:space="preserve">Go over to the RDS Console and click ‘create database.’ </w:t>
       </w:r>
     </w:p>
@@ -1056,8 +1077,14 @@
           <w:numId w:val="3"/>
         </w:numPr>
         <w:ind w:right="40" w:hanging="360"/>
-      </w:pPr>
-      <w:r>
+        <w:rPr>
+          <w:sz w:val="24"/>
+        </w:rPr>
+      </w:pPr>
+      <w:r>
+        <w:rPr>
+          <w:sz w:val="24"/>
+        </w:rPr>
         <w:t xml:space="preserve">Within the console select ‘standard create’. </w:t>
       </w:r>
     </w:p>
@@ -1069,8 +1096,14 @@
         </w:numPr>
         <w:spacing w:after="27"/>
         <w:ind w:right="40" w:hanging="360"/>
-      </w:pPr>
-      <w:r>
+        <w:rPr>
+          <w:sz w:val="24"/>
+        </w:rPr>
+      </w:pPr>
+      <w:r>
+        <w:rPr>
+          <w:sz w:val="24"/>
+        </w:rPr>
         <w:t xml:space="preserve">Select MySQL and select ‘dev/test’ under the sample template options. Choose ‘single instance’ under Availability and Security.  </w:t>
       </w:r>
     </w:p>
@@ -1081,22 +1114,40 @@
           <w:numId w:val="3"/>
         </w:numPr>
         <w:ind w:right="40" w:hanging="360"/>
-      </w:pPr>
-      <w:r>
+        <w:rPr>
+          <w:sz w:val="24"/>
+        </w:rPr>
+      </w:pPr>
+      <w:r>
+        <w:rPr>
+          <w:sz w:val="24"/>
+        </w:rPr>
         <w:t>For ‘DB instance identifier’ use the name ‘dc-</w:t>
       </w:r>
       <w:proofErr w:type="spellStart"/>
       <w:r>
+        <w:rPr>
+          <w:sz w:val="24"/>
+        </w:rPr>
         <w:t>php</w:t>
       </w:r>
       <w:proofErr w:type="spellEnd"/>
       <w:r>
+        <w:rPr>
+          <w:sz w:val="24"/>
+        </w:rPr>
         <w:t xml:space="preserve">-webapp-database’ and choose admin for the master username, and ‘password’ for the password. Make a note of these </w:t>
       </w:r>
       <w:r>
+        <w:rPr>
+          <w:sz w:val="24"/>
+        </w:rPr>
         <w:t>as they will be used</w:t>
       </w:r>
       <w:r>
+        <w:rPr>
+          <w:sz w:val="24"/>
+        </w:rPr>
         <w:t xml:space="preserve"> later. </w:t>
       </w:r>
     </w:p>
@@ -1107,8 +1158,14 @@
           <w:numId w:val="3"/>
         </w:numPr>
         <w:ind w:right="40" w:hanging="360"/>
-      </w:pPr>
-      <w:r>
+        <w:rPr>
+          <w:sz w:val="24"/>
+        </w:rPr>
+      </w:pPr>
+      <w:r>
+        <w:rPr>
+          <w:sz w:val="24"/>
+        </w:rPr>
         <w:t xml:space="preserve">Change the storage type to ‘General Purpose SSD (gp2)’ and set the allocation to 20 GB. </w:t>
       </w:r>
     </w:p>
@@ -1119,24 +1176,42 @@
           <w:numId w:val="3"/>
         </w:numPr>
         <w:ind w:right="40" w:hanging="360"/>
-      </w:pPr>
-      <w:r>
+        <w:rPr>
+          <w:sz w:val="24"/>
+        </w:rPr>
+      </w:pPr>
+      <w:r>
+        <w:rPr>
+          <w:sz w:val="24"/>
+        </w:rPr>
         <w:t>Scroll down and select the Default VPC and choose the dc-</w:t>
       </w:r>
       <w:proofErr w:type="spellStart"/>
       <w:r>
+        <w:rPr>
+          <w:sz w:val="24"/>
+        </w:rPr>
         <w:t>php</w:t>
       </w:r>
       <w:proofErr w:type="spellEnd"/>
       <w:r>
+        <w:rPr>
+          <w:sz w:val="24"/>
+        </w:rPr>
         <w:t>-webapp-</w:t>
       </w:r>
       <w:proofErr w:type="spellStart"/>
       <w:r>
+        <w:rPr>
+          <w:sz w:val="24"/>
+        </w:rPr>
         <w:t>dbserverssg</w:t>
       </w:r>
       <w:proofErr w:type="spellEnd"/>
       <w:r>
+        <w:rPr>
+          <w:sz w:val="24"/>
+        </w:rPr>
         <w:t xml:space="preserve">, deselecting the default security group. </w:t>
       </w:r>
     </w:p>
@@ -1147,8 +1222,14 @@
           <w:numId w:val="3"/>
         </w:numPr>
         <w:ind w:right="40" w:hanging="360"/>
-      </w:pPr>
-      <w:r>
+        <w:rPr>
+          <w:sz w:val="24"/>
+        </w:rPr>
+      </w:pPr>
+      <w:r>
+        <w:rPr>
+          <w:sz w:val="24"/>
+        </w:rPr>
         <w:t xml:space="preserve">Expand the additional configuration and call the initial database ‘sample’.  </w:t>
       </w:r>
     </w:p>
@@ -1159,8 +1240,14 @@
           <w:numId w:val="3"/>
         </w:numPr>
         <w:ind w:right="40" w:hanging="360"/>
-      </w:pPr>
-      <w:r>
+        <w:rPr>
+          <w:sz w:val="24"/>
+        </w:rPr>
+      </w:pPr>
+      <w:r>
+        <w:rPr>
+          <w:sz w:val="24"/>
+        </w:rPr>
         <w:t xml:space="preserve">Click create. </w:t>
       </w:r>
     </w:p>
@@ -1171,8 +1258,14 @@
           <w:numId w:val="3"/>
         </w:numPr>
         <w:ind w:right="40" w:hanging="360"/>
-      </w:pPr>
-      <w:r>
+        <w:rPr>
+          <w:sz w:val="24"/>
+        </w:rPr>
+      </w:pPr>
+      <w:r>
+        <w:rPr>
+          <w:sz w:val="24"/>
+        </w:rPr>
         <w:t xml:space="preserve">Once created make a note of the RDS endpoint. </w:t>
       </w:r>
     </w:p>
@@ -2249,88 +2342,154 @@
     <w:p>
       <w:pPr>
         <w:ind w:right="40"/>
-      </w:pPr>
-      <w:r>
+        <w:rPr>
+          <w:sz w:val="24"/>
+        </w:rPr>
+      </w:pPr>
+      <w:r>
+        <w:rPr>
+          <w:sz w:val="24"/>
+        </w:rPr>
         <w:t xml:space="preserve">CREATE TABLE orders (id </w:t>
       </w:r>
       <w:proofErr w:type="gramStart"/>
       <w:r>
+        <w:rPr>
+          <w:sz w:val="24"/>
+        </w:rPr>
         <w:t>INT(</w:t>
       </w:r>
       <w:proofErr w:type="gramEnd"/>
       <w:r>
+        <w:rPr>
+          <w:sz w:val="24"/>
+        </w:rPr>
         <w:t xml:space="preserve">6) UNSIGNED AUTO_INCREMENT PRIMARY KEY, </w:t>
       </w:r>
       <w:proofErr w:type="spellStart"/>
       <w:r>
+        <w:rPr>
+          <w:sz w:val="24"/>
+        </w:rPr>
         <w:t>ordernumber</w:t>
       </w:r>
       <w:proofErr w:type="spellEnd"/>
       <w:r>
+        <w:rPr>
+          <w:sz w:val="24"/>
+        </w:rPr>
         <w:t xml:space="preserve"> </w:t>
       </w:r>
       <w:proofErr w:type="gramStart"/>
       <w:r>
+        <w:rPr>
+          <w:sz w:val="24"/>
+        </w:rPr>
         <w:t>VARCHAR(</w:t>
       </w:r>
       <w:proofErr w:type="gramEnd"/>
       <w:r>
+        <w:rPr>
+          <w:sz w:val="24"/>
+        </w:rPr>
         <w:t xml:space="preserve">30) NOT NULL, </w:t>
       </w:r>
       <w:proofErr w:type="spellStart"/>
       <w:r>
+        <w:rPr>
+          <w:sz w:val="24"/>
+        </w:rPr>
         <w:t>customername</w:t>
       </w:r>
       <w:proofErr w:type="spellEnd"/>
       <w:r>
+        <w:rPr>
+          <w:sz w:val="24"/>
+        </w:rPr>
         <w:t xml:space="preserve"> </w:t>
       </w:r>
       <w:proofErr w:type="gramStart"/>
       <w:r>
+        <w:rPr>
+          <w:sz w:val="24"/>
+        </w:rPr>
         <w:t>VARCHAR(</w:t>
       </w:r>
       <w:proofErr w:type="gramEnd"/>
       <w:r>
+        <w:rPr>
+          <w:sz w:val="24"/>
+        </w:rPr>
         <w:t xml:space="preserve">30) NOT NULL, address </w:t>
       </w:r>
       <w:proofErr w:type="gramStart"/>
       <w:r>
+        <w:rPr>
+          <w:sz w:val="24"/>
+        </w:rPr>
         <w:t>VARCHAR(</w:t>
       </w:r>
       <w:proofErr w:type="gramEnd"/>
       <w:r>
+        <w:rPr>
+          <w:sz w:val="24"/>
+        </w:rPr>
         <w:t xml:space="preserve">150) NOT NULL, item </w:t>
       </w:r>
       <w:proofErr w:type="gramStart"/>
       <w:r>
+        <w:rPr>
+          <w:sz w:val="24"/>
+        </w:rPr>
         <w:t>VARCHAR(</w:t>
       </w:r>
       <w:proofErr w:type="gramEnd"/>
       <w:r>
+        <w:rPr>
+          <w:sz w:val="24"/>
+        </w:rPr>
         <w:t xml:space="preserve">50) NOT NULL, price </w:t>
       </w:r>
       <w:proofErr w:type="gramStart"/>
       <w:r>
+        <w:rPr>
+          <w:sz w:val="24"/>
+        </w:rPr>
         <w:t>DECIMAL(</w:t>
       </w:r>
       <w:proofErr w:type="gramEnd"/>
       <w:r>
+        <w:rPr>
+          <w:sz w:val="24"/>
+        </w:rPr>
         <w:t xml:space="preserve">10,2) </w:t>
       </w:r>
     </w:p>
     <w:p>
       <w:pPr>
         <w:ind w:right="40"/>
-      </w:pPr>
-      <w:r>
+        <w:rPr>
+          <w:sz w:val="24"/>
+        </w:rPr>
+      </w:pPr>
+      <w:r>
+        <w:rPr>
+          <w:sz w:val="24"/>
+        </w:rPr>
         <w:t xml:space="preserve">NOT NULL, date TIMESTAMP DEFAULT CURRENT_TIMESTAMP ON UPDATE </w:t>
       </w:r>
     </w:p>
     <w:p>
       <w:pPr>
         <w:ind w:right="40"/>
-      </w:pPr>
-      <w:r>
+        <w:rPr>
+          <w:sz w:val="24"/>
+        </w:rPr>
+      </w:pPr>
+      <w:r>
+        <w:rPr>
+          <w:sz w:val="24"/>
+        </w:rPr>
         <w:t xml:space="preserve">CURRENT_TIMESTAMP); </w:t>
       </w:r>
     </w:p>

</xml_diff>